<commit_message>
[OS-131] feat: b2 (b2.3) at v0.51.0 — acts 4, 5, 6 and 10 loaded; 10 modelo CSVs and l01 re-derived
Co-Authored-By: Claude Fable 5.1 <noreply@anthropic.com>
Claude-Session: https://claude.ai/code/session_01TDnhSnH9NoJsB18kzSB38U
</commit_message>
<xml_diff>
--- a/painel/relatorios/paineis/l01-atos-por-deputado.docx
+++ b/painel/relatorios/paineis/l01-atos-por-deputado.docx
@@ -87,7 +87,7 @@
           <w:sz w:val="26"/>
           <w:szCs w:val="26"/>
         </w:rPr>
-        <w:t xml:space="preserve">72.286 de 79.092 linha(s) publicada(s) — 91,4%</w:t>
+        <w:t xml:space="preserve">128.103 de 143.095 linha(s) publicada(s) — 89,5%</w:t>
       </w:r>
     </w:p>
     <w:p>
@@ -974,6 +974,62 @@
                 <w:sz w:val="18"/>
                 <w:szCs w:val="18"/>
               </w:rPr>
+              <w:t xml:space="preserve">Deputada Arlete Sampaio</w:t>
+            </w:r>
+          </w:p>
+        </w:tc>
+        <w:tc>
+          <w:tcPr>
+            <w:tcW w:w="3220" w:type="dxa"/>
+          </w:tcPr>
+          <w:p>
+            <w:pPr>
+              <w:spacing w:after="0"/>
+            </w:pPr>
+            <w:r>
+              <w:rPr>
+                <w:rFonts w:ascii="Helvetica" w:hAnsi="Helvetica" w:cs="Helvetica"/>
+                <w:sz w:val="18"/>
+                <w:szCs w:val="18"/>
+              </w:rPr>
+              <w:t xml:space="preserve">22</w:t>
+            </w:r>
+          </w:p>
+        </w:tc>
+        <w:tc>
+          <w:tcPr>
+            <w:tcW w:w="3220" w:type="dxa"/>
+          </w:tcPr>
+          <w:p>
+            <w:pPr>
+              <w:spacing w:after="0"/>
+            </w:pPr>
+            <w:r>
+              <w:rPr>
+                <w:rFonts w:ascii="Helvetica" w:hAnsi="Helvetica" w:cs="Helvetica"/>
+                <w:sz w:val="18"/>
+                <w:szCs w:val="18"/>
+              </w:rPr>
+              <w:t xml:space="preserve">0</w:t>
+            </w:r>
+          </w:p>
+        </w:tc>
+      </w:tr>
+      <w:tr>
+        <w:tc>
+          <w:tcPr>
+            <w:tcW w:w="3220" w:type="dxa"/>
+          </w:tcPr>
+          <w:p>
+            <w:pPr>
+              <w:spacing w:after="0"/>
+            </w:pPr>
+            <w:r>
+              <w:rPr>
+                <w:rFonts w:ascii="Helvetica" w:hAnsi="Helvetica" w:cs="Helvetica"/>
+                <w:sz w:val="18"/>
+                <w:szCs w:val="18"/>
+              </w:rPr>
               <w:t xml:space="preserve">Deputada Dayse Amarilio</w:t>
             </w:r>
           </w:p>
@@ -992,7 +1048,175 @@
                 <w:sz w:val="18"/>
                 <w:szCs w:val="18"/>
               </w:rPr>
-              <w:t xml:space="preserve">4.241</w:t>
+              <w:t xml:space="preserve">6.576</w:t>
+            </w:r>
+          </w:p>
+        </w:tc>
+        <w:tc>
+          <w:tcPr>
+            <w:tcW w:w="3220" w:type="dxa"/>
+          </w:tcPr>
+          <w:p>
+            <w:pPr>
+              <w:spacing w:after="0"/>
+            </w:pPr>
+            <w:r>
+              <w:rPr>
+                <w:rFonts w:ascii="Helvetica" w:hAnsi="Helvetica" w:cs="Helvetica"/>
+                <w:sz w:val="18"/>
+                <w:szCs w:val="18"/>
+              </w:rPr>
+              <w:t xml:space="preserve">15.590.815.500</w:t>
+            </w:r>
+          </w:p>
+        </w:tc>
+      </w:tr>
+      <w:tr>
+        <w:tc>
+          <w:tcPr>
+            <w:tcW w:w="3220" w:type="dxa"/>
+          </w:tcPr>
+          <w:p>
+            <w:pPr>
+              <w:spacing w:after="0"/>
+            </w:pPr>
+            <w:r>
+              <w:rPr>
+                <w:rFonts w:ascii="Helvetica" w:hAnsi="Helvetica" w:cs="Helvetica"/>
+                <w:sz w:val="18"/>
+                <w:szCs w:val="18"/>
+              </w:rPr>
+              <w:t xml:space="preserve">Deputada Doutora Jane</w:t>
+            </w:r>
+          </w:p>
+        </w:tc>
+        <w:tc>
+          <w:tcPr>
+            <w:tcW w:w="3220" w:type="dxa"/>
+          </w:tcPr>
+          <w:p>
+            <w:pPr>
+              <w:spacing w:after="0"/>
+            </w:pPr>
+            <w:r>
+              <w:rPr>
+                <w:rFonts w:ascii="Helvetica" w:hAnsi="Helvetica" w:cs="Helvetica"/>
+                <w:sz w:val="18"/>
+                <w:szCs w:val="18"/>
+              </w:rPr>
+              <w:t xml:space="preserve">4.801</w:t>
+            </w:r>
+          </w:p>
+        </w:tc>
+        <w:tc>
+          <w:tcPr>
+            <w:tcW w:w="3220" w:type="dxa"/>
+          </w:tcPr>
+          <w:p>
+            <w:pPr>
+              <w:spacing w:after="0"/>
+            </w:pPr>
+            <w:r>
+              <w:rPr>
+                <w:rFonts w:ascii="Helvetica" w:hAnsi="Helvetica" w:cs="Helvetica"/>
+                <w:sz w:val="18"/>
+                <w:szCs w:val="18"/>
+              </w:rPr>
+              <w:t xml:space="preserve">15.630.807.300</w:t>
+            </w:r>
+          </w:p>
+        </w:tc>
+      </w:tr>
+      <w:tr>
+        <w:tc>
+          <w:tcPr>
+            <w:tcW w:w="3220" w:type="dxa"/>
+          </w:tcPr>
+          <w:p>
+            <w:pPr>
+              <w:spacing w:after="0"/>
+            </w:pPr>
+            <w:r>
+              <w:rPr>
+                <w:rFonts w:ascii="Helvetica" w:hAnsi="Helvetica" w:cs="Helvetica"/>
+                <w:sz w:val="18"/>
+                <w:szCs w:val="18"/>
+              </w:rPr>
+              <w:t xml:space="preserve">Deputada Jaqueline Silva</w:t>
+            </w:r>
+          </w:p>
+        </w:tc>
+        <w:tc>
+          <w:tcPr>
+            <w:tcW w:w="3220" w:type="dxa"/>
+          </w:tcPr>
+          <w:p>
+            <w:pPr>
+              <w:spacing w:after="0"/>
+            </w:pPr>
+            <w:r>
+              <w:rPr>
+                <w:rFonts w:ascii="Helvetica" w:hAnsi="Helvetica" w:cs="Helvetica"/>
+                <w:sz w:val="18"/>
+                <w:szCs w:val="18"/>
+              </w:rPr>
+              <w:t xml:space="preserve">8.797</w:t>
+            </w:r>
+          </w:p>
+        </w:tc>
+        <w:tc>
+          <w:tcPr>
+            <w:tcW w:w="3220" w:type="dxa"/>
+          </w:tcPr>
+          <w:p>
+            <w:pPr>
+              <w:spacing w:after="0"/>
+            </w:pPr>
+            <w:r>
+              <w:rPr>
+                <w:rFonts w:ascii="Helvetica" w:hAnsi="Helvetica" w:cs="Helvetica"/>
+                <w:sz w:val="18"/>
+                <w:szCs w:val="18"/>
+              </w:rPr>
+              <w:t xml:space="preserve">13.095.522.500</w:t>
+            </w:r>
+          </w:p>
+        </w:tc>
+      </w:tr>
+      <w:tr>
+        <w:tc>
+          <w:tcPr>
+            <w:tcW w:w="3220" w:type="dxa"/>
+          </w:tcPr>
+          <w:p>
+            <w:pPr>
+              <w:spacing w:after="0"/>
+            </w:pPr>
+            <w:r>
+              <w:rPr>
+                <w:rFonts w:ascii="Helvetica" w:hAnsi="Helvetica" w:cs="Helvetica"/>
+                <w:sz w:val="18"/>
+                <w:szCs w:val="18"/>
+              </w:rPr>
+              <w:t xml:space="preserve">Deputada Júlia Lucy</w:t>
+            </w:r>
+          </w:p>
+        </w:tc>
+        <w:tc>
+          <w:tcPr>
+            <w:tcW w:w="3220" w:type="dxa"/>
+          </w:tcPr>
+          <w:p>
+            <w:pPr>
+              <w:spacing w:after="0"/>
+            </w:pPr>
+            <w:r>
+              <w:rPr>
+                <w:rFonts w:ascii="Helvetica" w:hAnsi="Helvetica" w:cs="Helvetica"/>
+                <w:sz w:val="18"/>
+                <w:szCs w:val="18"/>
+              </w:rPr>
+              <w:t xml:space="preserve">25</w:t>
             </w:r>
           </w:p>
         </w:tc>
@@ -1030,25 +1254,81 @@
                 <w:sz w:val="18"/>
                 <w:szCs w:val="18"/>
               </w:rPr>
-              <w:t xml:space="preserve">Deputada Doutora Jane</w:t>
-            </w:r>
-          </w:p>
-        </w:tc>
-        <w:tc>
-          <w:tcPr>
-            <w:tcW w:w="3220" w:type="dxa"/>
-          </w:tcPr>
-          <w:p>
-            <w:pPr>
-              <w:spacing w:after="0"/>
-            </w:pPr>
-            <w:r>
-              <w:rPr>
-                <w:rFonts w:ascii="Helvetica" w:hAnsi="Helvetica" w:cs="Helvetica"/>
-                <w:sz w:val="18"/>
-                <w:szCs w:val="18"/>
-              </w:rPr>
-              <w:t xml:space="preserve">2.650</w:t>
+              <w:t xml:space="preserve">Deputada Paula Belmonte</w:t>
+            </w:r>
+          </w:p>
+        </w:tc>
+        <w:tc>
+          <w:tcPr>
+            <w:tcW w:w="3220" w:type="dxa"/>
+          </w:tcPr>
+          <w:p>
+            <w:pPr>
+              <w:spacing w:after="0"/>
+            </w:pPr>
+            <w:r>
+              <w:rPr>
+                <w:rFonts w:ascii="Helvetica" w:hAnsi="Helvetica" w:cs="Helvetica"/>
+                <w:sz w:val="18"/>
+                <w:szCs w:val="18"/>
+              </w:rPr>
+              <w:t xml:space="preserve">6.569</w:t>
+            </w:r>
+          </w:p>
+        </w:tc>
+        <w:tc>
+          <w:tcPr>
+            <w:tcW w:w="3220" w:type="dxa"/>
+          </w:tcPr>
+          <w:p>
+            <w:pPr>
+              <w:spacing w:after="0"/>
+            </w:pPr>
+            <w:r>
+              <w:rPr>
+                <w:rFonts w:ascii="Helvetica" w:hAnsi="Helvetica" w:cs="Helvetica"/>
+                <w:sz w:val="18"/>
+                <w:szCs w:val="18"/>
+              </w:rPr>
+              <w:t xml:space="preserve">15.389.894.900</w:t>
+            </w:r>
+          </w:p>
+        </w:tc>
+      </w:tr>
+      <w:tr>
+        <w:tc>
+          <w:tcPr>
+            <w:tcW w:w="3220" w:type="dxa"/>
+          </w:tcPr>
+          <w:p>
+            <w:pPr>
+              <w:spacing w:after="0"/>
+            </w:pPr>
+            <w:r>
+              <w:rPr>
+                <w:rFonts w:ascii="Helvetica" w:hAnsi="Helvetica" w:cs="Helvetica"/>
+                <w:sz w:val="18"/>
+                <w:szCs w:val="18"/>
+              </w:rPr>
+              <w:t xml:space="preserve">Deputado Agaciel Maia</w:t>
+            </w:r>
+          </w:p>
+        </w:tc>
+        <w:tc>
+          <w:tcPr>
+            <w:tcW w:w="3220" w:type="dxa"/>
+          </w:tcPr>
+          <w:p>
+            <w:pPr>
+              <w:spacing w:after="0"/>
+            </w:pPr>
+            <w:r>
+              <w:rPr>
+                <w:rFonts w:ascii="Helvetica" w:hAnsi="Helvetica" w:cs="Helvetica"/>
+                <w:sz w:val="18"/>
+                <w:szCs w:val="18"/>
+              </w:rPr>
+              <w:t xml:space="preserve">7</w:t>
             </w:r>
           </w:p>
         </w:tc>
@@ -1086,25 +1366,81 @@
                 <w:sz w:val="18"/>
                 <w:szCs w:val="18"/>
               </w:rPr>
-              <w:t xml:space="preserve">Deputada Jaqueline Silva</w:t>
-            </w:r>
-          </w:p>
-        </w:tc>
-        <w:tc>
-          <w:tcPr>
-            <w:tcW w:w="3220" w:type="dxa"/>
-          </w:tcPr>
-          <w:p>
-            <w:pPr>
-              <w:spacing w:after="0"/>
-            </w:pPr>
-            <w:r>
-              <w:rPr>
-                <w:rFonts w:ascii="Helvetica" w:hAnsi="Helvetica" w:cs="Helvetica"/>
-                <w:sz w:val="18"/>
-                <w:szCs w:val="18"/>
-              </w:rPr>
-              <w:t xml:space="preserve">6.391</w:t>
+              <w:t xml:space="preserve">Deputado Chico Vigilante</w:t>
+            </w:r>
+          </w:p>
+        </w:tc>
+        <w:tc>
+          <w:tcPr>
+            <w:tcW w:w="3220" w:type="dxa"/>
+          </w:tcPr>
+          <w:p>
+            <w:pPr>
+              <w:spacing w:after="0"/>
+            </w:pPr>
+            <w:r>
+              <w:rPr>
+                <w:rFonts w:ascii="Helvetica" w:hAnsi="Helvetica" w:cs="Helvetica"/>
+                <w:sz w:val="18"/>
+                <w:szCs w:val="18"/>
+              </w:rPr>
+              <w:t xml:space="preserve">3.649</w:t>
+            </w:r>
+          </w:p>
+        </w:tc>
+        <w:tc>
+          <w:tcPr>
+            <w:tcW w:w="3220" w:type="dxa"/>
+          </w:tcPr>
+          <w:p>
+            <w:pPr>
+              <w:spacing w:after="0"/>
+            </w:pPr>
+            <w:r>
+              <w:rPr>
+                <w:rFonts w:ascii="Helvetica" w:hAnsi="Helvetica" w:cs="Helvetica"/>
+                <w:sz w:val="18"/>
+                <w:szCs w:val="18"/>
+              </w:rPr>
+              <w:t xml:space="preserve">13.265.700.900</w:t>
+            </w:r>
+          </w:p>
+        </w:tc>
+      </w:tr>
+      <w:tr>
+        <w:tc>
+          <w:tcPr>
+            <w:tcW w:w="3220" w:type="dxa"/>
+          </w:tcPr>
+          <w:p>
+            <w:pPr>
+              <w:spacing w:after="0"/>
+            </w:pPr>
+            <w:r>
+              <w:rPr>
+                <w:rFonts w:ascii="Helvetica" w:hAnsi="Helvetica" w:cs="Helvetica"/>
+                <w:sz w:val="18"/>
+                <w:szCs w:val="18"/>
+              </w:rPr>
+              <w:t xml:space="preserve">Deputado Claudio Abrantes</w:t>
+            </w:r>
+          </w:p>
+        </w:tc>
+        <w:tc>
+          <w:tcPr>
+            <w:tcW w:w="3220" w:type="dxa"/>
+          </w:tcPr>
+          <w:p>
+            <w:pPr>
+              <w:spacing w:after="0"/>
+            </w:pPr>
+            <w:r>
+              <w:rPr>
+                <w:rFonts w:ascii="Helvetica" w:hAnsi="Helvetica" w:cs="Helvetica"/>
+                <w:sz w:val="18"/>
+                <w:szCs w:val="18"/>
+              </w:rPr>
+              <w:t xml:space="preserve">30</w:t>
             </w:r>
           </w:p>
         </w:tc>
@@ -1142,25 +1478,81 @@
                 <w:sz w:val="18"/>
                 <w:szCs w:val="18"/>
               </w:rPr>
-              <w:t xml:space="preserve">Deputada Paula Belmonte</w:t>
-            </w:r>
-          </w:p>
-        </w:tc>
-        <w:tc>
-          <w:tcPr>
-            <w:tcW w:w="3220" w:type="dxa"/>
-          </w:tcPr>
-          <w:p>
-            <w:pPr>
-              <w:spacing w:after="0"/>
-            </w:pPr>
-            <w:r>
-              <w:rPr>
-                <w:rFonts w:ascii="Helvetica" w:hAnsi="Helvetica" w:cs="Helvetica"/>
-                <w:sz w:val="18"/>
-                <w:szCs w:val="18"/>
-              </w:rPr>
-              <w:t xml:space="preserve">3.469</w:t>
+              <w:t xml:space="preserve">Deputado Daniel Donizet</w:t>
+            </w:r>
+          </w:p>
+        </w:tc>
+        <w:tc>
+          <w:tcPr>
+            <w:tcW w:w="3220" w:type="dxa"/>
+          </w:tcPr>
+          <w:p>
+            <w:pPr>
+              <w:spacing w:after="0"/>
+            </w:pPr>
+            <w:r>
+              <w:rPr>
+                <w:rFonts w:ascii="Helvetica" w:hAnsi="Helvetica" w:cs="Helvetica"/>
+                <w:sz w:val="18"/>
+                <w:szCs w:val="18"/>
+              </w:rPr>
+              <w:t xml:space="preserve">2.460</w:t>
+            </w:r>
+          </w:p>
+        </w:tc>
+        <w:tc>
+          <w:tcPr>
+            <w:tcW w:w="3220" w:type="dxa"/>
+          </w:tcPr>
+          <w:p>
+            <w:pPr>
+              <w:spacing w:after="0"/>
+            </w:pPr>
+            <w:r>
+              <w:rPr>
+                <w:rFonts w:ascii="Helvetica" w:hAnsi="Helvetica" w:cs="Helvetica"/>
+                <w:sz w:val="18"/>
+                <w:szCs w:val="18"/>
+              </w:rPr>
+              <w:t xml:space="preserve">13.578.971.200</w:t>
+            </w:r>
+          </w:p>
+        </w:tc>
+      </w:tr>
+      <w:tr>
+        <w:tc>
+          <w:tcPr>
+            <w:tcW w:w="3220" w:type="dxa"/>
+          </w:tcPr>
+          <w:p>
+            <w:pPr>
+              <w:spacing w:after="0"/>
+            </w:pPr>
+            <w:r>
+              <w:rPr>
+                <w:rFonts w:ascii="Helvetica" w:hAnsi="Helvetica" w:cs="Helvetica"/>
+                <w:sz w:val="18"/>
+                <w:szCs w:val="18"/>
+              </w:rPr>
+              <w:t xml:space="preserve">Deputado Delegado Fernando Fernandes</w:t>
+            </w:r>
+          </w:p>
+        </w:tc>
+        <w:tc>
+          <w:tcPr>
+            <w:tcW w:w="3220" w:type="dxa"/>
+          </w:tcPr>
+          <w:p>
+            <w:pPr>
+              <w:spacing w:after="0"/>
+            </w:pPr>
+            <w:r>
+              <w:rPr>
+                <w:rFonts w:ascii="Helvetica" w:hAnsi="Helvetica" w:cs="Helvetica"/>
+                <w:sz w:val="18"/>
+                <w:szCs w:val="18"/>
+              </w:rPr>
+              <w:t xml:space="preserve">13</w:t>
             </w:r>
           </w:p>
         </w:tc>
@@ -1198,25 +1590,25 @@
                 <w:sz w:val="18"/>
                 <w:szCs w:val="18"/>
               </w:rPr>
-              <w:t xml:space="preserve">Deputado Chico Vigilante</w:t>
-            </w:r>
-          </w:p>
-        </w:tc>
-        <w:tc>
-          <w:tcPr>
-            <w:tcW w:w="3220" w:type="dxa"/>
-          </w:tcPr>
-          <w:p>
-            <w:pPr>
-              <w:spacing w:after="0"/>
-            </w:pPr>
-            <w:r>
-              <w:rPr>
-                <w:rFonts w:ascii="Helvetica" w:hAnsi="Helvetica" w:cs="Helvetica"/>
-                <w:sz w:val="18"/>
-                <w:szCs w:val="18"/>
-              </w:rPr>
-              <w:t xml:space="preserve">1.499</w:t>
+              <w:t xml:space="preserve">Deputado Delmasso</w:t>
+            </w:r>
+          </w:p>
+        </w:tc>
+        <w:tc>
+          <w:tcPr>
+            <w:tcW w:w="3220" w:type="dxa"/>
+          </w:tcPr>
+          <w:p>
+            <w:pPr>
+              <w:spacing w:after="0"/>
+            </w:pPr>
+            <w:r>
+              <w:rPr>
+                <w:rFonts w:ascii="Helvetica" w:hAnsi="Helvetica" w:cs="Helvetica"/>
+                <w:sz w:val="18"/>
+                <w:szCs w:val="18"/>
+              </w:rPr>
+              <w:t xml:space="preserve">19</w:t>
             </w:r>
           </w:p>
         </w:tc>
@@ -1254,25 +1646,417 @@
                 <w:sz w:val="18"/>
                 <w:szCs w:val="18"/>
               </w:rPr>
-              <w:t xml:space="preserve">Deputado Daniel Donizet</w:t>
-            </w:r>
-          </w:p>
-        </w:tc>
-        <w:tc>
-          <w:tcPr>
-            <w:tcW w:w="3220" w:type="dxa"/>
-          </w:tcPr>
-          <w:p>
-            <w:pPr>
-              <w:spacing w:after="0"/>
-            </w:pPr>
-            <w:r>
-              <w:rPr>
-                <w:rFonts w:ascii="Helvetica" w:hAnsi="Helvetica" w:cs="Helvetica"/>
-                <w:sz w:val="18"/>
-                <w:szCs w:val="18"/>
-              </w:rPr>
-              <w:t xml:space="preserve">1.134</w:t>
+              <w:t xml:space="preserve">Deputado Eduardo Pedrosa</w:t>
+            </w:r>
+          </w:p>
+        </w:tc>
+        <w:tc>
+          <w:tcPr>
+            <w:tcW w:w="3220" w:type="dxa"/>
+          </w:tcPr>
+          <w:p>
+            <w:pPr>
+              <w:spacing w:after="0"/>
+            </w:pPr>
+            <w:r>
+              <w:rPr>
+                <w:rFonts w:ascii="Helvetica" w:hAnsi="Helvetica" w:cs="Helvetica"/>
+                <w:sz w:val="18"/>
+                <w:szCs w:val="18"/>
+              </w:rPr>
+              <w:t xml:space="preserve">5.088</w:t>
+            </w:r>
+          </w:p>
+        </w:tc>
+        <w:tc>
+          <w:tcPr>
+            <w:tcW w:w="3220" w:type="dxa"/>
+          </w:tcPr>
+          <w:p>
+            <w:pPr>
+              <w:spacing w:after="0"/>
+            </w:pPr>
+            <w:r>
+              <w:rPr>
+                <w:rFonts w:ascii="Helvetica" w:hAnsi="Helvetica" w:cs="Helvetica"/>
+                <w:sz w:val="18"/>
+                <w:szCs w:val="18"/>
+              </w:rPr>
+              <w:t xml:space="preserve">24.555.017.400</w:t>
+            </w:r>
+          </w:p>
+        </w:tc>
+      </w:tr>
+      <w:tr>
+        <w:tc>
+          <w:tcPr>
+            <w:tcW w:w="3220" w:type="dxa"/>
+          </w:tcPr>
+          <w:p>
+            <w:pPr>
+              <w:spacing w:after="0"/>
+            </w:pPr>
+            <w:r>
+              <w:rPr>
+                <w:rFonts w:ascii="Helvetica" w:hAnsi="Helvetica" w:cs="Helvetica"/>
+                <w:sz w:val="18"/>
+                <w:szCs w:val="18"/>
+              </w:rPr>
+              <w:t xml:space="preserve">Deputado Fábio Felix</w:t>
+            </w:r>
+          </w:p>
+        </w:tc>
+        <w:tc>
+          <w:tcPr>
+            <w:tcW w:w="3220" w:type="dxa"/>
+          </w:tcPr>
+          <w:p>
+            <w:pPr>
+              <w:spacing w:after="0"/>
+            </w:pPr>
+            <w:r>
+              <w:rPr>
+                <w:rFonts w:ascii="Helvetica" w:hAnsi="Helvetica" w:cs="Helvetica"/>
+                <w:sz w:val="18"/>
+                <w:szCs w:val="18"/>
+              </w:rPr>
+              <w:t xml:space="preserve">5.600</w:t>
+            </w:r>
+          </w:p>
+        </w:tc>
+        <w:tc>
+          <w:tcPr>
+            <w:tcW w:w="3220" w:type="dxa"/>
+          </w:tcPr>
+          <w:p>
+            <w:pPr>
+              <w:spacing w:after="0"/>
+            </w:pPr>
+            <w:r>
+              <w:rPr>
+                <w:rFonts w:ascii="Helvetica" w:hAnsi="Helvetica" w:cs="Helvetica"/>
+                <w:sz w:val="18"/>
+                <w:szCs w:val="18"/>
+              </w:rPr>
+              <w:t xml:space="preserve">12.011.730.700</w:t>
+            </w:r>
+          </w:p>
+        </w:tc>
+      </w:tr>
+      <w:tr>
+        <w:tc>
+          <w:tcPr>
+            <w:tcW w:w="3220" w:type="dxa"/>
+          </w:tcPr>
+          <w:p>
+            <w:pPr>
+              <w:spacing w:after="0"/>
+            </w:pPr>
+            <w:r>
+              <w:rPr>
+                <w:rFonts w:ascii="Helvetica" w:hAnsi="Helvetica" w:cs="Helvetica"/>
+                <w:sz w:val="18"/>
+                <w:szCs w:val="18"/>
+              </w:rPr>
+              <w:t xml:space="preserve">Deputado Gabriel Magno</w:t>
+            </w:r>
+          </w:p>
+        </w:tc>
+        <w:tc>
+          <w:tcPr>
+            <w:tcW w:w="3220" w:type="dxa"/>
+          </w:tcPr>
+          <w:p>
+            <w:pPr>
+              <w:spacing w:after="0"/>
+            </w:pPr>
+            <w:r>
+              <w:rPr>
+                <w:rFonts w:ascii="Helvetica" w:hAnsi="Helvetica" w:cs="Helvetica"/>
+                <w:sz w:val="18"/>
+                <w:szCs w:val="18"/>
+              </w:rPr>
+              <w:t xml:space="preserve">6.470</w:t>
+            </w:r>
+          </w:p>
+        </w:tc>
+        <w:tc>
+          <w:tcPr>
+            <w:tcW w:w="3220" w:type="dxa"/>
+          </w:tcPr>
+          <w:p>
+            <w:pPr>
+              <w:spacing w:after="0"/>
+            </w:pPr>
+            <w:r>
+              <w:rPr>
+                <w:rFonts w:ascii="Helvetica" w:hAnsi="Helvetica" w:cs="Helvetica"/>
+                <w:sz w:val="18"/>
+                <w:szCs w:val="18"/>
+              </w:rPr>
+              <w:t xml:space="preserve">15.048.747.200</w:t>
+            </w:r>
+          </w:p>
+        </w:tc>
+      </w:tr>
+      <w:tr>
+        <w:tc>
+          <w:tcPr>
+            <w:tcW w:w="3220" w:type="dxa"/>
+          </w:tcPr>
+          <w:p>
+            <w:pPr>
+              <w:spacing w:after="0"/>
+            </w:pPr>
+            <w:r>
+              <w:rPr>
+                <w:rFonts w:ascii="Helvetica" w:hAnsi="Helvetica" w:cs="Helvetica"/>
+                <w:sz w:val="18"/>
+                <w:szCs w:val="18"/>
+              </w:rPr>
+              <w:t xml:space="preserve">Deputado Hermeto</w:t>
+            </w:r>
+          </w:p>
+        </w:tc>
+        <w:tc>
+          <w:tcPr>
+            <w:tcW w:w="3220" w:type="dxa"/>
+          </w:tcPr>
+          <w:p>
+            <w:pPr>
+              <w:spacing w:after="0"/>
+            </w:pPr>
+            <w:r>
+              <w:rPr>
+                <w:rFonts w:ascii="Helvetica" w:hAnsi="Helvetica" w:cs="Helvetica"/>
+                <w:sz w:val="18"/>
+                <w:szCs w:val="18"/>
+              </w:rPr>
+              <w:t xml:space="preserve">3.876</w:t>
+            </w:r>
+          </w:p>
+        </w:tc>
+        <w:tc>
+          <w:tcPr>
+            <w:tcW w:w="3220" w:type="dxa"/>
+          </w:tcPr>
+          <w:p>
+            <w:pPr>
+              <w:spacing w:after="0"/>
+            </w:pPr>
+            <w:r>
+              <w:rPr>
+                <w:rFonts w:ascii="Helvetica" w:hAnsi="Helvetica" w:cs="Helvetica"/>
+                <w:sz w:val="18"/>
+                <w:szCs w:val="18"/>
+              </w:rPr>
+              <w:t xml:space="preserve">14.391.208.800</w:t>
+            </w:r>
+          </w:p>
+        </w:tc>
+      </w:tr>
+      <w:tr>
+        <w:tc>
+          <w:tcPr>
+            <w:tcW w:w="3220" w:type="dxa"/>
+          </w:tcPr>
+          <w:p>
+            <w:pPr>
+              <w:spacing w:after="0"/>
+            </w:pPr>
+            <w:r>
+              <w:rPr>
+                <w:rFonts w:ascii="Helvetica" w:hAnsi="Helvetica" w:cs="Helvetica"/>
+                <w:sz w:val="18"/>
+                <w:szCs w:val="18"/>
+              </w:rPr>
+              <w:t xml:space="preserve">Deputado Iolando</w:t>
+            </w:r>
+          </w:p>
+        </w:tc>
+        <w:tc>
+          <w:tcPr>
+            <w:tcW w:w="3220" w:type="dxa"/>
+          </w:tcPr>
+          <w:p>
+            <w:pPr>
+              <w:spacing w:after="0"/>
+            </w:pPr>
+            <w:r>
+              <w:rPr>
+                <w:rFonts w:ascii="Helvetica" w:hAnsi="Helvetica" w:cs="Helvetica"/>
+                <w:sz w:val="18"/>
+                <w:szCs w:val="18"/>
+              </w:rPr>
+              <w:t xml:space="preserve">3.796</w:t>
+            </w:r>
+          </w:p>
+        </w:tc>
+        <w:tc>
+          <w:tcPr>
+            <w:tcW w:w="3220" w:type="dxa"/>
+          </w:tcPr>
+          <w:p>
+            <w:pPr>
+              <w:spacing w:after="0"/>
+            </w:pPr>
+            <w:r>
+              <w:rPr>
+                <w:rFonts w:ascii="Helvetica" w:hAnsi="Helvetica" w:cs="Helvetica"/>
+                <w:sz w:val="18"/>
+                <w:szCs w:val="18"/>
+              </w:rPr>
+              <w:t xml:space="preserve">14.498.330.800</w:t>
+            </w:r>
+          </w:p>
+        </w:tc>
+      </w:tr>
+      <w:tr>
+        <w:tc>
+          <w:tcPr>
+            <w:tcW w:w="3220" w:type="dxa"/>
+          </w:tcPr>
+          <w:p>
+            <w:pPr>
+              <w:spacing w:after="0"/>
+            </w:pPr>
+            <w:r>
+              <w:rPr>
+                <w:rFonts w:ascii="Helvetica" w:hAnsi="Helvetica" w:cs="Helvetica"/>
+                <w:sz w:val="18"/>
+                <w:szCs w:val="18"/>
+              </w:rPr>
+              <w:t xml:space="preserve">Deputado Joaquim Roriz Neto</w:t>
+            </w:r>
+          </w:p>
+        </w:tc>
+        <w:tc>
+          <w:tcPr>
+            <w:tcW w:w="3220" w:type="dxa"/>
+          </w:tcPr>
+          <w:p>
+            <w:pPr>
+              <w:spacing w:after="0"/>
+            </w:pPr>
+            <w:r>
+              <w:rPr>
+                <w:rFonts w:ascii="Helvetica" w:hAnsi="Helvetica" w:cs="Helvetica"/>
+                <w:sz w:val="18"/>
+                <w:szCs w:val="18"/>
+              </w:rPr>
+              <w:t xml:space="preserve">10.958</w:t>
+            </w:r>
+          </w:p>
+        </w:tc>
+        <w:tc>
+          <w:tcPr>
+            <w:tcW w:w="3220" w:type="dxa"/>
+          </w:tcPr>
+          <w:p>
+            <w:pPr>
+              <w:spacing w:after="0"/>
+            </w:pPr>
+            <w:r>
+              <w:rPr>
+                <w:rFonts w:ascii="Helvetica" w:hAnsi="Helvetica" w:cs="Helvetica"/>
+                <w:sz w:val="18"/>
+                <w:szCs w:val="18"/>
+              </w:rPr>
+              <w:t xml:space="preserve">15.395.398.500</w:t>
+            </w:r>
+          </w:p>
+        </w:tc>
+      </w:tr>
+      <w:tr>
+        <w:tc>
+          <w:tcPr>
+            <w:tcW w:w="3220" w:type="dxa"/>
+          </w:tcPr>
+          <w:p>
+            <w:pPr>
+              <w:spacing w:after="0"/>
+            </w:pPr>
+            <w:r>
+              <w:rPr>
+                <w:rFonts w:ascii="Helvetica" w:hAnsi="Helvetica" w:cs="Helvetica"/>
+                <w:sz w:val="18"/>
+                <w:szCs w:val="18"/>
+              </w:rPr>
+              <w:t xml:space="preserve">Deputado Jorge Vianna</w:t>
+            </w:r>
+          </w:p>
+        </w:tc>
+        <w:tc>
+          <w:tcPr>
+            <w:tcW w:w="3220" w:type="dxa"/>
+          </w:tcPr>
+          <w:p>
+            <w:pPr>
+              <w:spacing w:after="0"/>
+            </w:pPr>
+            <w:r>
+              <w:rPr>
+                <w:rFonts w:ascii="Helvetica" w:hAnsi="Helvetica" w:cs="Helvetica"/>
+                <w:sz w:val="18"/>
+                <w:szCs w:val="18"/>
+              </w:rPr>
+              <w:t xml:space="preserve">5.565</w:t>
+            </w:r>
+          </w:p>
+        </w:tc>
+        <w:tc>
+          <w:tcPr>
+            <w:tcW w:w="3220" w:type="dxa"/>
+          </w:tcPr>
+          <w:p>
+            <w:pPr>
+              <w:spacing w:after="0"/>
+            </w:pPr>
+            <w:r>
+              <w:rPr>
+                <w:rFonts w:ascii="Helvetica" w:hAnsi="Helvetica" w:cs="Helvetica"/>
+                <w:sz w:val="18"/>
+                <w:szCs w:val="18"/>
+              </w:rPr>
+              <w:t xml:space="preserve">13.243.862.900</w:t>
+            </w:r>
+          </w:p>
+        </w:tc>
+      </w:tr>
+      <w:tr>
+        <w:tc>
+          <w:tcPr>
+            <w:tcW w:w="3220" w:type="dxa"/>
+          </w:tcPr>
+          <w:p>
+            <w:pPr>
+              <w:spacing w:after="0"/>
+            </w:pPr>
+            <w:r>
+              <w:rPr>
+                <w:rFonts w:ascii="Helvetica" w:hAnsi="Helvetica" w:cs="Helvetica"/>
+                <w:sz w:val="18"/>
+                <w:szCs w:val="18"/>
+              </w:rPr>
+              <w:t xml:space="preserve">Deputado José Gomes</w:t>
+            </w:r>
+          </w:p>
+        </w:tc>
+        <w:tc>
+          <w:tcPr>
+            <w:tcW w:w="3220" w:type="dxa"/>
+          </w:tcPr>
+          <w:p>
+            <w:pPr>
+              <w:spacing w:after="0"/>
+            </w:pPr>
+            <w:r>
+              <w:rPr>
+                <w:rFonts w:ascii="Helvetica" w:hAnsi="Helvetica" w:cs="Helvetica"/>
+                <w:sz w:val="18"/>
+                <w:szCs w:val="18"/>
+              </w:rPr>
+              <w:t xml:space="preserve">29</w:t>
             </w:r>
           </w:p>
         </w:tc>
@@ -1310,25 +2094,81 @@
                 <w:sz w:val="18"/>
                 <w:szCs w:val="18"/>
               </w:rPr>
-              <w:t xml:space="preserve">Deputado Eduardo Pedrosa</w:t>
-            </w:r>
-          </w:p>
-        </w:tc>
-        <w:tc>
-          <w:tcPr>
-            <w:tcW w:w="3220" w:type="dxa"/>
-          </w:tcPr>
-          <w:p>
-            <w:pPr>
-              <w:spacing w:after="0"/>
-            </w:pPr>
-            <w:r>
-              <w:rPr>
-                <w:rFonts w:ascii="Helvetica" w:hAnsi="Helvetica" w:cs="Helvetica"/>
-                <w:sz w:val="18"/>
-                <w:szCs w:val="18"/>
-              </w:rPr>
-              <w:t xml:space="preserve">3.095</w:t>
+              <w:t xml:space="preserve">Deputado João Cardoso</w:t>
+            </w:r>
+          </w:p>
+        </w:tc>
+        <w:tc>
+          <w:tcPr>
+            <w:tcW w:w="3220" w:type="dxa"/>
+          </w:tcPr>
+          <w:p>
+            <w:pPr>
+              <w:spacing w:after="0"/>
+            </w:pPr>
+            <w:r>
+              <w:rPr>
+                <w:rFonts w:ascii="Helvetica" w:hAnsi="Helvetica" w:cs="Helvetica"/>
+                <w:sz w:val="18"/>
+                <w:szCs w:val="18"/>
+              </w:rPr>
+              <w:t xml:space="preserve">5.311</w:t>
+            </w:r>
+          </w:p>
+        </w:tc>
+        <w:tc>
+          <w:tcPr>
+            <w:tcW w:w="3220" w:type="dxa"/>
+          </w:tcPr>
+          <w:p>
+            <w:pPr>
+              <w:spacing w:after="0"/>
+            </w:pPr>
+            <w:r>
+              <w:rPr>
+                <w:rFonts w:ascii="Helvetica" w:hAnsi="Helvetica" w:cs="Helvetica"/>
+                <w:sz w:val="18"/>
+                <w:szCs w:val="18"/>
+              </w:rPr>
+              <w:t xml:space="preserve">13.337.787.400</w:t>
+            </w:r>
+          </w:p>
+        </w:tc>
+      </w:tr>
+      <w:tr>
+        <w:tc>
+          <w:tcPr>
+            <w:tcW w:w="3220" w:type="dxa"/>
+          </w:tcPr>
+          <w:p>
+            <w:pPr>
+              <w:spacing w:after="0"/>
+            </w:pPr>
+            <w:r>
+              <w:rPr>
+                <w:rFonts w:ascii="Helvetica" w:hAnsi="Helvetica" w:cs="Helvetica"/>
+                <w:sz w:val="18"/>
+                <w:szCs w:val="18"/>
+              </w:rPr>
+              <w:t xml:space="preserve">Deputado Leandro Grass</w:t>
+            </w:r>
+          </w:p>
+        </w:tc>
+        <w:tc>
+          <w:tcPr>
+            <w:tcW w:w="3220" w:type="dxa"/>
+          </w:tcPr>
+          <w:p>
+            <w:pPr>
+              <w:spacing w:after="0"/>
+            </w:pPr>
+            <w:r>
+              <w:rPr>
+                <w:rFonts w:ascii="Helvetica" w:hAnsi="Helvetica" w:cs="Helvetica"/>
+                <w:sz w:val="18"/>
+                <w:szCs w:val="18"/>
+              </w:rPr>
+              <w:t xml:space="preserve">7</w:t>
             </w:r>
           </w:p>
         </w:tc>
@@ -1366,25 +2206,249 @@
                 <w:sz w:val="18"/>
                 <w:szCs w:val="18"/>
               </w:rPr>
-              <w:t xml:space="preserve">Deputado Fábio Felix</w:t>
-            </w:r>
-          </w:p>
-        </w:tc>
-        <w:tc>
-          <w:tcPr>
-            <w:tcW w:w="3220" w:type="dxa"/>
-          </w:tcPr>
-          <w:p>
-            <w:pPr>
-              <w:spacing w:after="0"/>
-            </w:pPr>
-            <w:r>
-              <w:rPr>
-                <w:rFonts w:ascii="Helvetica" w:hAnsi="Helvetica" w:cs="Helvetica"/>
-                <w:sz w:val="18"/>
-                <w:szCs w:val="18"/>
-              </w:rPr>
-              <w:t xml:space="preserve">3.045</w:t>
+              <w:t xml:space="preserve">Deputado Martins Machado</w:t>
+            </w:r>
+          </w:p>
+        </w:tc>
+        <w:tc>
+          <w:tcPr>
+            <w:tcW w:w="3220" w:type="dxa"/>
+          </w:tcPr>
+          <w:p>
+            <w:pPr>
+              <w:spacing w:after="0"/>
+            </w:pPr>
+            <w:r>
+              <w:rPr>
+                <w:rFonts w:ascii="Helvetica" w:hAnsi="Helvetica" w:cs="Helvetica"/>
+                <w:sz w:val="18"/>
+                <w:szCs w:val="18"/>
+              </w:rPr>
+              <w:t xml:space="preserve">5.715</w:t>
+            </w:r>
+          </w:p>
+        </w:tc>
+        <w:tc>
+          <w:tcPr>
+            <w:tcW w:w="3220" w:type="dxa"/>
+          </w:tcPr>
+          <w:p>
+            <w:pPr>
+              <w:spacing w:after="0"/>
+            </w:pPr>
+            <w:r>
+              <w:rPr>
+                <w:rFonts w:ascii="Helvetica" w:hAnsi="Helvetica" w:cs="Helvetica"/>
+                <w:sz w:val="18"/>
+                <w:szCs w:val="18"/>
+              </w:rPr>
+              <w:t xml:space="preserve">13.807.392.900</w:t>
+            </w:r>
+          </w:p>
+        </w:tc>
+      </w:tr>
+      <w:tr>
+        <w:tc>
+          <w:tcPr>
+            <w:tcW w:w="3220" w:type="dxa"/>
+          </w:tcPr>
+          <w:p>
+            <w:pPr>
+              <w:spacing w:after="0"/>
+            </w:pPr>
+            <w:r>
+              <w:rPr>
+                <w:rFonts w:ascii="Helvetica" w:hAnsi="Helvetica" w:cs="Helvetica"/>
+                <w:sz w:val="18"/>
+                <w:szCs w:val="18"/>
+              </w:rPr>
+              <w:t xml:space="preserve">Deputado Max Maciel</w:t>
+            </w:r>
+          </w:p>
+        </w:tc>
+        <w:tc>
+          <w:tcPr>
+            <w:tcW w:w="3220" w:type="dxa"/>
+          </w:tcPr>
+          <w:p>
+            <w:pPr>
+              <w:spacing w:after="0"/>
+            </w:pPr>
+            <w:r>
+              <w:rPr>
+                <w:rFonts w:ascii="Helvetica" w:hAnsi="Helvetica" w:cs="Helvetica"/>
+                <w:sz w:val="18"/>
+                <w:szCs w:val="18"/>
+              </w:rPr>
+              <w:t xml:space="preserve">6.243</w:t>
+            </w:r>
+          </w:p>
+        </w:tc>
+        <w:tc>
+          <w:tcPr>
+            <w:tcW w:w="3220" w:type="dxa"/>
+          </w:tcPr>
+          <w:p>
+            <w:pPr>
+              <w:spacing w:after="0"/>
+            </w:pPr>
+            <w:r>
+              <w:rPr>
+                <w:rFonts w:ascii="Helvetica" w:hAnsi="Helvetica" w:cs="Helvetica"/>
+                <w:sz w:val="18"/>
+                <w:szCs w:val="18"/>
+              </w:rPr>
+              <w:t xml:space="preserve">30.372.935.200</w:t>
+            </w:r>
+          </w:p>
+        </w:tc>
+      </w:tr>
+      <w:tr>
+        <w:tc>
+          <w:tcPr>
+            <w:tcW w:w="3220" w:type="dxa"/>
+          </w:tcPr>
+          <w:p>
+            <w:pPr>
+              <w:spacing w:after="0"/>
+            </w:pPr>
+            <w:r>
+              <w:rPr>
+                <w:rFonts w:ascii="Helvetica" w:hAnsi="Helvetica" w:cs="Helvetica"/>
+                <w:sz w:val="18"/>
+                <w:szCs w:val="18"/>
+              </w:rPr>
+              <w:t xml:space="preserve">Deputado Pastor Daniel de Castro</w:t>
+            </w:r>
+          </w:p>
+        </w:tc>
+        <w:tc>
+          <w:tcPr>
+            <w:tcW w:w="3220" w:type="dxa"/>
+          </w:tcPr>
+          <w:p>
+            <w:pPr>
+              <w:spacing w:after="0"/>
+            </w:pPr>
+            <w:r>
+              <w:rPr>
+                <w:rFonts w:ascii="Helvetica" w:hAnsi="Helvetica" w:cs="Helvetica"/>
+                <w:sz w:val="18"/>
+                <w:szCs w:val="18"/>
+              </w:rPr>
+              <w:t xml:space="preserve">6.072</w:t>
+            </w:r>
+          </w:p>
+        </w:tc>
+        <w:tc>
+          <w:tcPr>
+            <w:tcW w:w="3220" w:type="dxa"/>
+          </w:tcPr>
+          <w:p>
+            <w:pPr>
+              <w:spacing w:after="0"/>
+            </w:pPr>
+            <w:r>
+              <w:rPr>
+                <w:rFonts w:ascii="Helvetica" w:hAnsi="Helvetica" w:cs="Helvetica"/>
+                <w:sz w:val="18"/>
+                <w:szCs w:val="18"/>
+              </w:rPr>
+              <w:t xml:space="preserve">17.550.809.300</w:t>
+            </w:r>
+          </w:p>
+        </w:tc>
+      </w:tr>
+      <w:tr>
+        <w:tc>
+          <w:tcPr>
+            <w:tcW w:w="3220" w:type="dxa"/>
+          </w:tcPr>
+          <w:p>
+            <w:pPr>
+              <w:spacing w:after="0"/>
+            </w:pPr>
+            <w:r>
+              <w:rPr>
+                <w:rFonts w:ascii="Helvetica" w:hAnsi="Helvetica" w:cs="Helvetica"/>
+                <w:sz w:val="18"/>
+                <w:szCs w:val="18"/>
+              </w:rPr>
+              <w:t xml:space="preserve">Deputado Pepa</w:t>
+            </w:r>
+          </w:p>
+        </w:tc>
+        <w:tc>
+          <w:tcPr>
+            <w:tcW w:w="3220" w:type="dxa"/>
+          </w:tcPr>
+          <w:p>
+            <w:pPr>
+              <w:spacing w:after="0"/>
+            </w:pPr>
+            <w:r>
+              <w:rPr>
+                <w:rFonts w:ascii="Helvetica" w:hAnsi="Helvetica" w:cs="Helvetica"/>
+                <w:sz w:val="18"/>
+                <w:szCs w:val="18"/>
+              </w:rPr>
+              <w:t xml:space="preserve">3.769</w:t>
+            </w:r>
+          </w:p>
+        </w:tc>
+        <w:tc>
+          <w:tcPr>
+            <w:tcW w:w="3220" w:type="dxa"/>
+          </w:tcPr>
+          <w:p>
+            <w:pPr>
+              <w:spacing w:after="0"/>
+            </w:pPr>
+            <w:r>
+              <w:rPr>
+                <w:rFonts w:ascii="Helvetica" w:hAnsi="Helvetica" w:cs="Helvetica"/>
+                <w:sz w:val="18"/>
+                <w:szCs w:val="18"/>
+              </w:rPr>
+              <w:t xml:space="preserve">16.485.503.600</w:t>
+            </w:r>
+          </w:p>
+        </w:tc>
+      </w:tr>
+      <w:tr>
+        <w:tc>
+          <w:tcPr>
+            <w:tcW w:w="3220" w:type="dxa"/>
+          </w:tcPr>
+          <w:p>
+            <w:pPr>
+              <w:spacing w:after="0"/>
+            </w:pPr>
+            <w:r>
+              <w:rPr>
+                <w:rFonts w:ascii="Helvetica" w:hAnsi="Helvetica" w:cs="Helvetica"/>
+                <w:sz w:val="18"/>
+                <w:szCs w:val="18"/>
+              </w:rPr>
+              <w:t xml:space="preserve">Deputado Professor Reginaldo Veras</w:t>
+            </w:r>
+          </w:p>
+        </w:tc>
+        <w:tc>
+          <w:tcPr>
+            <w:tcW w:w="3220" w:type="dxa"/>
+          </w:tcPr>
+          <w:p>
+            <w:pPr>
+              <w:spacing w:after="0"/>
+            </w:pPr>
+            <w:r>
+              <w:rPr>
+                <w:rFonts w:ascii="Helvetica" w:hAnsi="Helvetica" w:cs="Helvetica"/>
+                <w:sz w:val="18"/>
+                <w:szCs w:val="18"/>
+              </w:rPr>
+              <w:t xml:space="preserve">11</w:t>
             </w:r>
           </w:p>
         </w:tc>
@@ -1422,25 +2486,25 @@
                 <w:sz w:val="18"/>
                 <w:szCs w:val="18"/>
               </w:rPr>
-              <w:t xml:space="preserve">Deputado Gabriel Magno</w:t>
-            </w:r>
-          </w:p>
-        </w:tc>
-        <w:tc>
-          <w:tcPr>
-            <w:tcW w:w="3220" w:type="dxa"/>
-          </w:tcPr>
-          <w:p>
-            <w:pPr>
-              <w:spacing w:after="0"/>
-            </w:pPr>
-            <w:r>
-              <w:rPr>
-                <w:rFonts w:ascii="Helvetica" w:hAnsi="Helvetica" w:cs="Helvetica"/>
-                <w:sz w:val="18"/>
-                <w:szCs w:val="18"/>
-              </w:rPr>
-              <w:t xml:space="preserve">3.880</w:t>
+              <w:t xml:space="preserve">Deputado Rafael Prudente</w:t>
+            </w:r>
+          </w:p>
+        </w:tc>
+        <w:tc>
+          <w:tcPr>
+            <w:tcW w:w="3220" w:type="dxa"/>
+          </w:tcPr>
+          <w:p>
+            <w:pPr>
+              <w:spacing w:after="0"/>
+            </w:pPr>
+            <w:r>
+              <w:rPr>
+                <w:rFonts w:ascii="Helvetica" w:hAnsi="Helvetica" w:cs="Helvetica"/>
+                <w:sz w:val="18"/>
+                <w:szCs w:val="18"/>
+              </w:rPr>
+              <w:t xml:space="preserve">11</w:t>
             </w:r>
           </w:p>
         </w:tc>
@@ -1478,25 +2542,25 @@
                 <w:sz w:val="18"/>
                 <w:szCs w:val="18"/>
               </w:rPr>
-              <w:t xml:space="preserve">Deputado Hermeto</w:t>
-            </w:r>
-          </w:p>
-        </w:tc>
-        <w:tc>
-          <w:tcPr>
-            <w:tcW w:w="3220" w:type="dxa"/>
-          </w:tcPr>
-          <w:p>
-            <w:pPr>
-              <w:spacing w:after="0"/>
-            </w:pPr>
-            <w:r>
-              <w:rPr>
-                <w:rFonts w:ascii="Helvetica" w:hAnsi="Helvetica" w:cs="Helvetica"/>
-                <w:sz w:val="18"/>
-                <w:szCs w:val="18"/>
-              </w:rPr>
-              <w:t xml:space="preserve">2.102</w:t>
+              <w:t xml:space="preserve">Deputado Reginaldo Sardinha</w:t>
+            </w:r>
+          </w:p>
+        </w:tc>
+        <w:tc>
+          <w:tcPr>
+            <w:tcW w:w="3220" w:type="dxa"/>
+          </w:tcPr>
+          <w:p>
+            <w:pPr>
+              <w:spacing w:after="0"/>
+            </w:pPr>
+            <w:r>
+              <w:rPr>
+                <w:rFonts w:ascii="Helvetica" w:hAnsi="Helvetica" w:cs="Helvetica"/>
+                <w:sz w:val="18"/>
+                <w:szCs w:val="18"/>
+              </w:rPr>
+              <w:t xml:space="preserve">8</w:t>
             </w:r>
           </w:p>
         </w:tc>
@@ -1534,510 +2598,6 @@
                 <w:sz w:val="18"/>
                 <w:szCs w:val="18"/>
               </w:rPr>
-              <w:t xml:space="preserve">Deputado Iolando</w:t>
-            </w:r>
-          </w:p>
-        </w:tc>
-        <w:tc>
-          <w:tcPr>
-            <w:tcW w:w="3220" w:type="dxa"/>
-          </w:tcPr>
-          <w:p>
-            <w:pPr>
-              <w:spacing w:after="0"/>
-            </w:pPr>
-            <w:r>
-              <w:rPr>
-                <w:rFonts w:ascii="Helvetica" w:hAnsi="Helvetica" w:cs="Helvetica"/>
-                <w:sz w:val="18"/>
-                <w:szCs w:val="18"/>
-              </w:rPr>
-              <w:t xml:space="preserve">1.910</w:t>
-            </w:r>
-          </w:p>
-        </w:tc>
-        <w:tc>
-          <w:tcPr>
-            <w:tcW w:w="3220" w:type="dxa"/>
-          </w:tcPr>
-          <w:p>
-            <w:pPr>
-              <w:spacing w:after="0"/>
-            </w:pPr>
-            <w:r>
-              <w:rPr>
-                <w:rFonts w:ascii="Helvetica" w:hAnsi="Helvetica" w:cs="Helvetica"/>
-                <w:sz w:val="18"/>
-                <w:szCs w:val="18"/>
-              </w:rPr>
-              <w:t xml:space="preserve">0</w:t>
-            </w:r>
-          </w:p>
-        </w:tc>
-      </w:tr>
-      <w:tr>
-        <w:tc>
-          <w:tcPr>
-            <w:tcW w:w="3220" w:type="dxa"/>
-          </w:tcPr>
-          <w:p>
-            <w:pPr>
-              <w:spacing w:after="0"/>
-            </w:pPr>
-            <w:r>
-              <w:rPr>
-                <w:rFonts w:ascii="Helvetica" w:hAnsi="Helvetica" w:cs="Helvetica"/>
-                <w:sz w:val="18"/>
-                <w:szCs w:val="18"/>
-              </w:rPr>
-              <w:t xml:space="preserve">Deputado Joaquim Roriz Neto</w:t>
-            </w:r>
-          </w:p>
-        </w:tc>
-        <w:tc>
-          <w:tcPr>
-            <w:tcW w:w="3220" w:type="dxa"/>
-          </w:tcPr>
-          <w:p>
-            <w:pPr>
-              <w:spacing w:after="0"/>
-            </w:pPr>
-            <w:r>
-              <w:rPr>
-                <w:rFonts w:ascii="Helvetica" w:hAnsi="Helvetica" w:cs="Helvetica"/>
-                <w:sz w:val="18"/>
-                <w:szCs w:val="18"/>
-              </w:rPr>
-              <w:t xml:space="preserve">9.025</w:t>
-            </w:r>
-          </w:p>
-        </w:tc>
-        <w:tc>
-          <w:tcPr>
-            <w:tcW w:w="3220" w:type="dxa"/>
-          </w:tcPr>
-          <w:p>
-            <w:pPr>
-              <w:spacing w:after="0"/>
-            </w:pPr>
-            <w:r>
-              <w:rPr>
-                <w:rFonts w:ascii="Helvetica" w:hAnsi="Helvetica" w:cs="Helvetica"/>
-                <w:sz w:val="18"/>
-                <w:szCs w:val="18"/>
-              </w:rPr>
-              <w:t xml:space="preserve">0</w:t>
-            </w:r>
-          </w:p>
-        </w:tc>
-      </w:tr>
-      <w:tr>
-        <w:tc>
-          <w:tcPr>
-            <w:tcW w:w="3220" w:type="dxa"/>
-          </w:tcPr>
-          <w:p>
-            <w:pPr>
-              <w:spacing w:after="0"/>
-            </w:pPr>
-            <w:r>
-              <w:rPr>
-                <w:rFonts w:ascii="Helvetica" w:hAnsi="Helvetica" w:cs="Helvetica"/>
-                <w:sz w:val="18"/>
-                <w:szCs w:val="18"/>
-              </w:rPr>
-              <w:t xml:space="preserve">Deputado Jorge Vianna</w:t>
-            </w:r>
-          </w:p>
-        </w:tc>
-        <w:tc>
-          <w:tcPr>
-            <w:tcW w:w="3220" w:type="dxa"/>
-          </w:tcPr>
-          <w:p>
-            <w:pPr>
-              <w:spacing w:after="0"/>
-            </w:pPr>
-            <w:r>
-              <w:rPr>
-                <w:rFonts w:ascii="Helvetica" w:hAnsi="Helvetica" w:cs="Helvetica"/>
-                <w:sz w:val="18"/>
-                <w:szCs w:val="18"/>
-              </w:rPr>
-              <w:t xml:space="preserve">2.089</w:t>
-            </w:r>
-          </w:p>
-        </w:tc>
-        <w:tc>
-          <w:tcPr>
-            <w:tcW w:w="3220" w:type="dxa"/>
-          </w:tcPr>
-          <w:p>
-            <w:pPr>
-              <w:spacing w:after="0"/>
-            </w:pPr>
-            <w:r>
-              <w:rPr>
-                <w:rFonts w:ascii="Helvetica" w:hAnsi="Helvetica" w:cs="Helvetica"/>
-                <w:sz w:val="18"/>
-                <w:szCs w:val="18"/>
-              </w:rPr>
-              <w:t xml:space="preserve">0</w:t>
-            </w:r>
-          </w:p>
-        </w:tc>
-      </w:tr>
-      <w:tr>
-        <w:tc>
-          <w:tcPr>
-            <w:tcW w:w="3220" w:type="dxa"/>
-          </w:tcPr>
-          <w:p>
-            <w:pPr>
-              <w:spacing w:after="0"/>
-            </w:pPr>
-            <w:r>
-              <w:rPr>
-                <w:rFonts w:ascii="Helvetica" w:hAnsi="Helvetica" w:cs="Helvetica"/>
-                <w:sz w:val="18"/>
-                <w:szCs w:val="18"/>
-              </w:rPr>
-              <w:t xml:space="preserve">Deputado João Cardoso</w:t>
-            </w:r>
-          </w:p>
-        </w:tc>
-        <w:tc>
-          <w:tcPr>
-            <w:tcW w:w="3220" w:type="dxa"/>
-          </w:tcPr>
-          <w:p>
-            <w:pPr>
-              <w:spacing w:after="0"/>
-            </w:pPr>
-            <w:r>
-              <w:rPr>
-                <w:rFonts w:ascii="Helvetica" w:hAnsi="Helvetica" w:cs="Helvetica"/>
-                <w:sz w:val="18"/>
-                <w:szCs w:val="18"/>
-              </w:rPr>
-              <w:t xml:space="preserve">2.232</w:t>
-            </w:r>
-          </w:p>
-        </w:tc>
-        <w:tc>
-          <w:tcPr>
-            <w:tcW w:w="3220" w:type="dxa"/>
-          </w:tcPr>
-          <w:p>
-            <w:pPr>
-              <w:spacing w:after="0"/>
-            </w:pPr>
-            <w:r>
-              <w:rPr>
-                <w:rFonts w:ascii="Helvetica" w:hAnsi="Helvetica" w:cs="Helvetica"/>
-                <w:sz w:val="18"/>
-                <w:szCs w:val="18"/>
-              </w:rPr>
-              <w:t xml:space="preserve">0</w:t>
-            </w:r>
-          </w:p>
-        </w:tc>
-      </w:tr>
-      <w:tr>
-        <w:tc>
-          <w:tcPr>
-            <w:tcW w:w="3220" w:type="dxa"/>
-          </w:tcPr>
-          <w:p>
-            <w:pPr>
-              <w:spacing w:after="0"/>
-            </w:pPr>
-            <w:r>
-              <w:rPr>
-                <w:rFonts w:ascii="Helvetica" w:hAnsi="Helvetica" w:cs="Helvetica"/>
-                <w:sz w:val="18"/>
-                <w:szCs w:val="18"/>
-              </w:rPr>
-              <w:t xml:space="preserve">Deputado Martins Machado</w:t>
-            </w:r>
-          </w:p>
-        </w:tc>
-        <w:tc>
-          <w:tcPr>
-            <w:tcW w:w="3220" w:type="dxa"/>
-          </w:tcPr>
-          <w:p>
-            <w:pPr>
-              <w:spacing w:after="0"/>
-            </w:pPr>
-            <w:r>
-              <w:rPr>
-                <w:rFonts w:ascii="Helvetica" w:hAnsi="Helvetica" w:cs="Helvetica"/>
-                <w:sz w:val="18"/>
-                <w:szCs w:val="18"/>
-              </w:rPr>
-              <w:t xml:space="preserve">2.187</w:t>
-            </w:r>
-          </w:p>
-        </w:tc>
-        <w:tc>
-          <w:tcPr>
-            <w:tcW w:w="3220" w:type="dxa"/>
-          </w:tcPr>
-          <w:p>
-            <w:pPr>
-              <w:spacing w:after="0"/>
-            </w:pPr>
-            <w:r>
-              <w:rPr>
-                <w:rFonts w:ascii="Helvetica" w:hAnsi="Helvetica" w:cs="Helvetica"/>
-                <w:sz w:val="18"/>
-                <w:szCs w:val="18"/>
-              </w:rPr>
-              <w:t xml:space="preserve">0</w:t>
-            </w:r>
-          </w:p>
-        </w:tc>
-      </w:tr>
-      <w:tr>
-        <w:tc>
-          <w:tcPr>
-            <w:tcW w:w="3220" w:type="dxa"/>
-          </w:tcPr>
-          <w:p>
-            <w:pPr>
-              <w:spacing w:after="0"/>
-            </w:pPr>
-            <w:r>
-              <w:rPr>
-                <w:rFonts w:ascii="Helvetica" w:hAnsi="Helvetica" w:cs="Helvetica"/>
-                <w:sz w:val="18"/>
-                <w:szCs w:val="18"/>
-              </w:rPr>
-              <w:t xml:space="preserve">Deputado Max Maciel</w:t>
-            </w:r>
-          </w:p>
-        </w:tc>
-        <w:tc>
-          <w:tcPr>
-            <w:tcW w:w="3220" w:type="dxa"/>
-          </w:tcPr>
-          <w:p>
-            <w:pPr>
-              <w:spacing w:after="0"/>
-            </w:pPr>
-            <w:r>
-              <w:rPr>
-                <w:rFonts w:ascii="Helvetica" w:hAnsi="Helvetica" w:cs="Helvetica"/>
-                <w:sz w:val="18"/>
-                <w:szCs w:val="18"/>
-              </w:rPr>
-              <w:t xml:space="preserve">3.333</w:t>
-            </w:r>
-          </w:p>
-        </w:tc>
-        <w:tc>
-          <w:tcPr>
-            <w:tcW w:w="3220" w:type="dxa"/>
-          </w:tcPr>
-          <w:p>
-            <w:pPr>
-              <w:spacing w:after="0"/>
-            </w:pPr>
-            <w:r>
-              <w:rPr>
-                <w:rFonts w:ascii="Helvetica" w:hAnsi="Helvetica" w:cs="Helvetica"/>
-                <w:sz w:val="18"/>
-                <w:szCs w:val="18"/>
-              </w:rPr>
-              <w:t xml:space="preserve">0</w:t>
-            </w:r>
-          </w:p>
-        </w:tc>
-      </w:tr>
-      <w:tr>
-        <w:tc>
-          <w:tcPr>
-            <w:tcW w:w="3220" w:type="dxa"/>
-          </w:tcPr>
-          <w:p>
-            <w:pPr>
-              <w:spacing w:after="0"/>
-            </w:pPr>
-            <w:r>
-              <w:rPr>
-                <w:rFonts w:ascii="Helvetica" w:hAnsi="Helvetica" w:cs="Helvetica"/>
-                <w:sz w:val="18"/>
-                <w:szCs w:val="18"/>
-              </w:rPr>
-              <w:t xml:space="preserve">Deputado Pastor Daniel de Castro</w:t>
-            </w:r>
-          </w:p>
-        </w:tc>
-        <w:tc>
-          <w:tcPr>
-            <w:tcW w:w="3220" w:type="dxa"/>
-          </w:tcPr>
-          <w:p>
-            <w:pPr>
-              <w:spacing w:after="0"/>
-            </w:pPr>
-            <w:r>
-              <w:rPr>
-                <w:rFonts w:ascii="Helvetica" w:hAnsi="Helvetica" w:cs="Helvetica"/>
-                <w:sz w:val="18"/>
-                <w:szCs w:val="18"/>
-              </w:rPr>
-              <w:t xml:space="preserve">4.192</w:t>
-            </w:r>
-          </w:p>
-        </w:tc>
-        <w:tc>
-          <w:tcPr>
-            <w:tcW w:w="3220" w:type="dxa"/>
-          </w:tcPr>
-          <w:p>
-            <w:pPr>
-              <w:spacing w:after="0"/>
-            </w:pPr>
-            <w:r>
-              <w:rPr>
-                <w:rFonts w:ascii="Helvetica" w:hAnsi="Helvetica" w:cs="Helvetica"/>
-                <w:sz w:val="18"/>
-                <w:szCs w:val="18"/>
-              </w:rPr>
-              <w:t xml:space="preserve">0</w:t>
-            </w:r>
-          </w:p>
-        </w:tc>
-      </w:tr>
-      <w:tr>
-        <w:tc>
-          <w:tcPr>
-            <w:tcW w:w="3220" w:type="dxa"/>
-          </w:tcPr>
-          <w:p>
-            <w:pPr>
-              <w:spacing w:after="0"/>
-            </w:pPr>
-            <w:r>
-              <w:rPr>
-                <w:rFonts w:ascii="Helvetica" w:hAnsi="Helvetica" w:cs="Helvetica"/>
-                <w:sz w:val="18"/>
-                <w:szCs w:val="18"/>
-              </w:rPr>
-              <w:t xml:space="preserve">Deputado Pepa</w:t>
-            </w:r>
-          </w:p>
-        </w:tc>
-        <w:tc>
-          <w:tcPr>
-            <w:tcW w:w="3220" w:type="dxa"/>
-          </w:tcPr>
-          <w:p>
-            <w:pPr>
-              <w:spacing w:after="0"/>
-            </w:pPr>
-            <w:r>
-              <w:rPr>
-                <w:rFonts w:ascii="Helvetica" w:hAnsi="Helvetica" w:cs="Helvetica"/>
-                <w:sz w:val="18"/>
-                <w:szCs w:val="18"/>
-              </w:rPr>
-              <w:t xml:space="preserve">2.051</w:t>
-            </w:r>
-          </w:p>
-        </w:tc>
-        <w:tc>
-          <w:tcPr>
-            <w:tcW w:w="3220" w:type="dxa"/>
-          </w:tcPr>
-          <w:p>
-            <w:pPr>
-              <w:spacing w:after="0"/>
-            </w:pPr>
-            <w:r>
-              <w:rPr>
-                <w:rFonts w:ascii="Helvetica" w:hAnsi="Helvetica" w:cs="Helvetica"/>
-                <w:sz w:val="18"/>
-                <w:szCs w:val="18"/>
-              </w:rPr>
-              <w:t xml:space="preserve">0</w:t>
-            </w:r>
-          </w:p>
-        </w:tc>
-      </w:tr>
-      <w:tr>
-        <w:tc>
-          <w:tcPr>
-            <w:tcW w:w="3220" w:type="dxa"/>
-          </w:tcPr>
-          <w:p>
-            <w:pPr>
-              <w:spacing w:after="0"/>
-            </w:pPr>
-            <w:r>
-              <w:rPr>
-                <w:rFonts w:ascii="Helvetica" w:hAnsi="Helvetica" w:cs="Helvetica"/>
-                <w:sz w:val="18"/>
-                <w:szCs w:val="18"/>
-              </w:rPr>
-              <w:t xml:space="preserve">Deputado Rafael Prudente</w:t>
-            </w:r>
-          </w:p>
-        </w:tc>
-        <w:tc>
-          <w:tcPr>
-            <w:tcW w:w="3220" w:type="dxa"/>
-          </w:tcPr>
-          <w:p>
-            <w:pPr>
-              <w:spacing w:after="0"/>
-            </w:pPr>
-            <w:r>
-              <w:rPr>
-                <w:rFonts w:ascii="Helvetica" w:hAnsi="Helvetica" w:cs="Helvetica"/>
-                <w:sz w:val="18"/>
-                <w:szCs w:val="18"/>
-              </w:rPr>
-              <w:t xml:space="preserve">1</w:t>
-            </w:r>
-          </w:p>
-        </w:tc>
-        <w:tc>
-          <w:tcPr>
-            <w:tcW w:w="3220" w:type="dxa"/>
-          </w:tcPr>
-          <w:p>
-            <w:pPr>
-              <w:spacing w:after="0"/>
-            </w:pPr>
-            <w:r>
-              <w:rPr>
-                <w:rFonts w:ascii="Helvetica" w:hAnsi="Helvetica" w:cs="Helvetica"/>
-                <w:sz w:val="18"/>
-                <w:szCs w:val="18"/>
-              </w:rPr>
-              <w:t xml:space="preserve">0</w:t>
-            </w:r>
-          </w:p>
-        </w:tc>
-      </w:tr>
-      <w:tr>
-        <w:tc>
-          <w:tcPr>
-            <w:tcW w:w="3220" w:type="dxa"/>
-          </w:tcPr>
-          <w:p>
-            <w:pPr>
-              <w:spacing w:after="0"/>
-            </w:pPr>
-            <w:r>
-              <w:rPr>
-                <w:rFonts w:ascii="Helvetica" w:hAnsi="Helvetica" w:cs="Helvetica"/>
-                <w:sz w:val="18"/>
-                <w:szCs w:val="18"/>
-              </w:rPr>
               <w:t xml:space="preserve">Deputado Ricardo Vale</w:t>
             </w:r>
           </w:p>
@@ -2056,25 +2616,25 @@
                 <w:sz w:val="18"/>
                 <w:szCs w:val="18"/>
               </w:rPr>
-              <w:t xml:space="preserve">2.917</w:t>
-            </w:r>
-          </w:p>
-        </w:tc>
-        <w:tc>
-          <w:tcPr>
-            <w:tcW w:w="3220" w:type="dxa"/>
-          </w:tcPr>
-          <w:p>
-            <w:pPr>
-              <w:spacing w:after="0"/>
-            </w:pPr>
-            <w:r>
-              <w:rPr>
-                <w:rFonts w:ascii="Helvetica" w:hAnsi="Helvetica" w:cs="Helvetica"/>
-                <w:sz w:val="18"/>
-                <w:szCs w:val="18"/>
-              </w:rPr>
-              <w:t xml:space="preserve">0</w:t>
+              <w:t xml:space="preserve">5.011</w:t>
+            </w:r>
+          </w:p>
+        </w:tc>
+        <w:tc>
+          <w:tcPr>
+            <w:tcW w:w="3220" w:type="dxa"/>
+          </w:tcPr>
+          <w:p>
+            <w:pPr>
+              <w:spacing w:after="0"/>
+            </w:pPr>
+            <w:r>
+              <w:rPr>
+                <w:rFonts w:ascii="Helvetica" w:hAnsi="Helvetica" w:cs="Helvetica"/>
+                <w:sz w:val="18"/>
+                <w:szCs w:val="18"/>
+              </w:rPr>
+              <w:t xml:space="preserve">15.101.969.100</w:t>
             </w:r>
           </w:p>
         </w:tc>
@@ -2112,25 +2672,25 @@
                 <w:sz w:val="18"/>
                 <w:szCs w:val="18"/>
               </w:rPr>
-              <w:t xml:space="preserve">2.482</w:t>
-            </w:r>
-          </w:p>
-        </w:tc>
-        <w:tc>
-          <w:tcPr>
-            <w:tcW w:w="3220" w:type="dxa"/>
-          </w:tcPr>
-          <w:p>
-            <w:pPr>
-              <w:spacing w:after="0"/>
-            </w:pPr>
-            <w:r>
-              <w:rPr>
-                <w:rFonts w:ascii="Helvetica" w:hAnsi="Helvetica" w:cs="Helvetica"/>
-                <w:sz w:val="18"/>
-                <w:szCs w:val="18"/>
-              </w:rPr>
-              <w:t xml:space="preserve">0</w:t>
+              <w:t xml:space="preserve">4.966</w:t>
+            </w:r>
+          </w:p>
+        </w:tc>
+        <w:tc>
+          <w:tcPr>
+            <w:tcW w:w="3220" w:type="dxa"/>
+          </w:tcPr>
+          <w:p>
+            <w:pPr>
+              <w:spacing w:after="0"/>
+            </w:pPr>
+            <w:r>
+              <w:rPr>
+                <w:rFonts w:ascii="Helvetica" w:hAnsi="Helvetica" w:cs="Helvetica"/>
+                <w:sz w:val="18"/>
+                <w:szCs w:val="18"/>
+              </w:rPr>
+              <w:t xml:space="preserve">14.517.029.100</w:t>
             </w:r>
           </w:p>
         </w:tc>
@@ -2168,25 +2728,25 @@
                 <w:sz w:val="18"/>
                 <w:szCs w:val="18"/>
               </w:rPr>
-              <w:t xml:space="preserve">2.347</w:t>
-            </w:r>
-          </w:p>
-        </w:tc>
-        <w:tc>
-          <w:tcPr>
-            <w:tcW w:w="3220" w:type="dxa"/>
-          </w:tcPr>
-          <w:p>
-            <w:pPr>
-              <w:spacing w:after="0"/>
-            </w:pPr>
-            <w:r>
-              <w:rPr>
-                <w:rFonts w:ascii="Helvetica" w:hAnsi="Helvetica" w:cs="Helvetica"/>
-                <w:sz w:val="18"/>
-                <w:szCs w:val="18"/>
-              </w:rPr>
-              <w:t xml:space="preserve">0</w:t>
+              <w:t xml:space="preserve">4.745</w:t>
+            </w:r>
+          </w:p>
+        </w:tc>
+        <w:tc>
+          <w:tcPr>
+            <w:tcW w:w="3220" w:type="dxa"/>
+          </w:tcPr>
+          <w:p>
+            <w:pPr>
+              <w:spacing w:after="0"/>
+            </w:pPr>
+            <w:r>
+              <w:rPr>
+                <w:rFonts w:ascii="Helvetica" w:hAnsi="Helvetica" w:cs="Helvetica"/>
+                <w:sz w:val="18"/>
+                <w:szCs w:val="18"/>
+              </w:rPr>
+              <w:t xml:space="preserve">15.988.789.800</w:t>
             </w:r>
           </w:p>
         </w:tc>
@@ -2224,25 +2784,25 @@
                 <w:sz w:val="18"/>
                 <w:szCs w:val="18"/>
               </w:rPr>
-              <w:t xml:space="preserve">1.703</w:t>
-            </w:r>
-          </w:p>
-        </w:tc>
-        <w:tc>
-          <w:tcPr>
-            <w:tcW w:w="3220" w:type="dxa"/>
-          </w:tcPr>
-          <w:p>
-            <w:pPr>
-              <w:spacing w:after="0"/>
-            </w:pPr>
-            <w:r>
-              <w:rPr>
-                <w:rFonts w:ascii="Helvetica" w:hAnsi="Helvetica" w:cs="Helvetica"/>
-                <w:sz w:val="18"/>
-                <w:szCs w:val="18"/>
-              </w:rPr>
-              <w:t xml:space="preserve">0</w:t>
+              <w:t xml:space="preserve">3.687</w:t>
+            </w:r>
+          </w:p>
+        </w:tc>
+        <w:tc>
+          <w:tcPr>
+            <w:tcW w:w="3220" w:type="dxa"/>
+          </w:tcPr>
+          <w:p>
+            <w:pPr>
+              <w:spacing w:after="0"/>
+            </w:pPr>
+            <w:r>
+              <w:rPr>
+                <w:rFonts w:ascii="Helvetica" w:hAnsi="Helvetica" w:cs="Helvetica"/>
+                <w:sz w:val="18"/>
+                <w:szCs w:val="18"/>
+              </w:rPr>
+              <w:t xml:space="preserve">14.362.532.700</w:t>
             </w:r>
           </w:p>
         </w:tc>
@@ -2280,25 +2840,25 @@
                 <w:sz w:val="18"/>
                 <w:szCs w:val="18"/>
               </w:rPr>
-              <w:t xml:space="preserve">1.953</w:t>
-            </w:r>
-          </w:p>
-        </w:tc>
-        <w:tc>
-          <w:tcPr>
-            <w:tcW w:w="3220" w:type="dxa"/>
-          </w:tcPr>
-          <w:p>
-            <w:pPr>
-              <w:spacing w:after="0"/>
-            </w:pPr>
-            <w:r>
-              <w:rPr>
-                <w:rFonts w:ascii="Helvetica" w:hAnsi="Helvetica" w:cs="Helvetica"/>
-                <w:sz w:val="18"/>
-                <w:szCs w:val="18"/>
-              </w:rPr>
-              <w:t xml:space="preserve">0</w:t>
+              <w:t xml:space="preserve">4.859</w:t>
+            </w:r>
+          </w:p>
+        </w:tc>
+        <w:tc>
+          <w:tcPr>
+            <w:tcW w:w="3220" w:type="dxa"/>
+          </w:tcPr>
+          <w:p>
+            <w:pPr>
+              <w:spacing w:after="0"/>
+            </w:pPr>
+            <w:r>
+              <w:rPr>
+                <w:rFonts w:ascii="Helvetica" w:hAnsi="Helvetica" w:cs="Helvetica"/>
+                <w:sz w:val="18"/>
+                <w:szCs w:val="18"/>
+              </w:rPr>
+              <w:t xml:space="preserve">19.967.539.750</w:t>
             </w:r>
           </w:p>
         </w:tc>
@@ -2336,25 +2896,25 @@
                 <w:sz w:val="18"/>
                 <w:szCs w:val="18"/>
               </w:rPr>
-              <w:t xml:space="preserve">1.721</w:t>
-            </w:r>
-          </w:p>
-        </w:tc>
-        <w:tc>
-          <w:tcPr>
-            <w:tcW w:w="3220" w:type="dxa"/>
-          </w:tcPr>
-          <w:p>
-            <w:pPr>
-              <w:spacing w:after="0"/>
-            </w:pPr>
-            <w:r>
-              <w:rPr>
-                <w:rFonts w:ascii="Helvetica" w:hAnsi="Helvetica" w:cs="Helvetica"/>
-                <w:sz w:val="18"/>
-                <w:szCs w:val="18"/>
-              </w:rPr>
-              <w:t xml:space="preserve">0</w:t>
+              <w:t xml:space="preserve">2.701</w:t>
+            </w:r>
+          </w:p>
+        </w:tc>
+        <w:tc>
+          <w:tcPr>
+            <w:tcW w:w="3220" w:type="dxa"/>
+          </w:tcPr>
+          <w:p>
+            <w:pPr>
+              <w:spacing w:after="0"/>
+            </w:pPr>
+            <w:r>
+              <w:rPr>
+                <w:rFonts w:ascii="Helvetica" w:hAnsi="Helvetica" w:cs="Helvetica"/>
+                <w:sz w:val="18"/>
+                <w:szCs w:val="18"/>
+              </w:rPr>
+              <w:t xml:space="preserve">16.616.446.700</w:t>
             </w:r>
           </w:p>
         </w:tc>
@@ -2801,6 +3361,174 @@
                 <w:sz w:val="18"/>
                 <w:szCs w:val="18"/>
               </w:rPr>
+              <w:t xml:space="preserve">emendou o orçamento</w:t>
+            </w:r>
+          </w:p>
+        </w:tc>
+        <w:tc>
+          <w:tcPr>
+            <w:tcW w:w="3220" w:type="dxa"/>
+          </w:tcPr>
+          <w:p>
+            <w:pPr>
+              <w:spacing w:after="0"/>
+            </w:pPr>
+            <w:r>
+              <w:rPr>
+                <w:rFonts w:ascii="Helvetica" w:hAnsi="Helvetica" w:cs="Helvetica"/>
+                <w:sz w:val="18"/>
+                <w:szCs w:val="18"/>
+              </w:rPr>
+              <w:t xml:space="preserve">4.803</w:t>
+            </w:r>
+          </w:p>
+        </w:tc>
+        <w:tc>
+          <w:tcPr>
+            <w:tcW w:w="3220" w:type="dxa"/>
+          </w:tcPr>
+          <w:p>
+            <w:pPr>
+              <w:spacing w:after="0"/>
+            </w:pPr>
+            <w:r>
+              <w:rPr>
+                <w:rFonts w:ascii="Helvetica" w:hAnsi="Helvetica" w:cs="Helvetica"/>
+                <w:sz w:val="18"/>
+                <w:szCs w:val="18"/>
+              </w:rPr>
+              <w:t xml:space="preserve">383.804.744.150</w:t>
+            </w:r>
+          </w:p>
+        </w:tc>
+      </w:tr>
+      <w:tr>
+        <w:tc>
+          <w:tcPr>
+            <w:tcW w:w="3220" w:type="dxa"/>
+          </w:tcPr>
+          <w:p>
+            <w:pPr>
+              <w:spacing w:after="0"/>
+            </w:pPr>
+            <w:r>
+              <w:rPr>
+                <w:rFonts w:ascii="Helvetica" w:hAnsi="Helvetica" w:cs="Helvetica"/>
+                <w:sz w:val="18"/>
+                <w:szCs w:val="18"/>
+              </w:rPr>
+              <w:t xml:space="preserve">esteve presente</w:t>
+            </w:r>
+          </w:p>
+        </w:tc>
+        <w:tc>
+          <w:tcPr>
+            <w:tcW w:w="3220" w:type="dxa"/>
+          </w:tcPr>
+          <w:p>
+            <w:pPr>
+              <w:spacing w:after="0"/>
+            </w:pPr>
+            <w:r>
+              <w:rPr>
+                <w:rFonts w:ascii="Helvetica" w:hAnsi="Helvetica" w:cs="Helvetica"/>
+                <w:sz w:val="18"/>
+                <w:szCs w:val="18"/>
+              </w:rPr>
+              <w:t xml:space="preserve">8.746</w:t>
+            </w:r>
+          </w:p>
+        </w:tc>
+        <w:tc>
+          <w:tcPr>
+            <w:tcW w:w="3220" w:type="dxa"/>
+          </w:tcPr>
+          <w:p>
+            <w:pPr>
+              <w:spacing w:after="0"/>
+            </w:pPr>
+            <w:r>
+              <w:rPr>
+                <w:rFonts w:ascii="Helvetica" w:hAnsi="Helvetica" w:cs="Helvetica"/>
+                <w:sz w:val="18"/>
+                <w:szCs w:val="18"/>
+              </w:rPr>
+              <w:t xml:space="preserve">0</w:t>
+            </w:r>
+          </w:p>
+        </w:tc>
+      </w:tr>
+      <w:tr>
+        <w:tc>
+          <w:tcPr>
+            <w:tcW w:w="3220" w:type="dxa"/>
+          </w:tcPr>
+          <w:p>
+            <w:pPr>
+              <w:spacing w:after="0"/>
+            </w:pPr>
+            <w:r>
+              <w:rPr>
+                <w:rFonts w:ascii="Helvetica" w:hAnsi="Helvetica" w:cs="Helvetica"/>
+                <w:sz w:val="18"/>
+                <w:szCs w:val="18"/>
+              </w:rPr>
+              <w:t xml:space="preserve">integra comissão / CPI</w:t>
+            </w:r>
+          </w:p>
+        </w:tc>
+        <w:tc>
+          <w:tcPr>
+            <w:tcW w:w="3220" w:type="dxa"/>
+          </w:tcPr>
+          <w:p>
+            <w:pPr>
+              <w:spacing w:after="0"/>
+            </w:pPr>
+            <w:r>
+              <w:rPr>
+                <w:rFonts w:ascii="Helvetica" w:hAnsi="Helvetica" w:cs="Helvetica"/>
+                <w:sz w:val="18"/>
+                <w:szCs w:val="18"/>
+              </w:rPr>
+              <w:t xml:space="preserve">329</w:t>
+            </w:r>
+          </w:p>
+        </w:tc>
+        <w:tc>
+          <w:tcPr>
+            <w:tcW w:w="3220" w:type="dxa"/>
+          </w:tcPr>
+          <w:p>
+            <w:pPr>
+              <w:spacing w:after="0"/>
+            </w:pPr>
+            <w:r>
+              <w:rPr>
+                <w:rFonts w:ascii="Helvetica" w:hAnsi="Helvetica" w:cs="Helvetica"/>
+                <w:sz w:val="18"/>
+                <w:szCs w:val="18"/>
+              </w:rPr>
+              <w:t xml:space="preserve">0</w:t>
+            </w:r>
+          </w:p>
+        </w:tc>
+      </w:tr>
+      <w:tr>
+        <w:tc>
+          <w:tcPr>
+            <w:tcW w:w="3220" w:type="dxa"/>
+          </w:tcPr>
+          <w:p>
+            <w:pPr>
+              <w:spacing w:after="0"/>
+            </w:pPr>
+            <w:r>
+              <w:rPr>
+                <w:rFonts w:ascii="Helvetica" w:hAnsi="Helvetica" w:cs="Helvetica"/>
+                <w:sz w:val="18"/>
+                <w:szCs w:val="18"/>
+              </w:rPr>
               <w:t xml:space="preserve">relatou (parecer)</w:t>
             </w:r>
           </w:p>
@@ -2820,6 +3548,62 @@
                 <w:szCs w:val="18"/>
               </w:rPr>
               <w:t xml:space="preserve">2.742</w:t>
+            </w:r>
+          </w:p>
+        </w:tc>
+        <w:tc>
+          <w:tcPr>
+            <w:tcW w:w="3220" w:type="dxa"/>
+          </w:tcPr>
+          <w:p>
+            <w:pPr>
+              <w:spacing w:after="0"/>
+            </w:pPr>
+            <w:r>
+              <w:rPr>
+                <w:rFonts w:ascii="Helvetica" w:hAnsi="Helvetica" w:cs="Helvetica"/>
+                <w:sz w:val="18"/>
+                <w:szCs w:val="18"/>
+              </w:rPr>
+              <w:t xml:space="preserve">0</w:t>
+            </w:r>
+          </w:p>
+        </w:tc>
+      </w:tr>
+      <w:tr>
+        <w:tc>
+          <w:tcPr>
+            <w:tcW w:w="3220" w:type="dxa"/>
+          </w:tcPr>
+          <w:p>
+            <w:pPr>
+              <w:spacing w:after="0"/>
+            </w:pPr>
+            <w:r>
+              <w:rPr>
+                <w:rFonts w:ascii="Helvetica" w:hAnsi="Helvetica" w:cs="Helvetica"/>
+                <w:sz w:val="18"/>
+                <w:szCs w:val="18"/>
+              </w:rPr>
+              <w:t xml:space="preserve">votou</w:t>
+            </w:r>
+          </w:p>
+        </w:tc>
+        <w:tc>
+          <w:tcPr>
+            <w:tcW w:w="3220" w:type="dxa"/>
+          </w:tcPr>
+          <w:p>
+            <w:pPr>
+              <w:spacing w:after="0"/>
+            </w:pPr>
+            <w:r>
+              <w:rPr>
+                <w:rFonts w:ascii="Helvetica" w:hAnsi="Helvetica" w:cs="Helvetica"/>
+                <w:sz w:val="18"/>
+                <w:szCs w:val="18"/>
+              </w:rPr>
+              <w:t xml:space="preserve">41.939</w:t>
             </w:r>
           </w:p>
         </w:tc>
@@ -2966,25 +3750,25 @@
                 <w:sz w:val="18"/>
                 <w:szCs w:val="18"/>
               </w:rPr>
-              <w:t xml:space="preserve">29.783</w:t>
-            </w:r>
-          </w:p>
-        </w:tc>
-        <w:tc>
-          <w:tcPr>
-            <w:tcW w:w="3220" w:type="dxa"/>
-          </w:tcPr>
-          <w:p>
-            <w:pPr>
-              <w:spacing w:after="0"/>
-            </w:pPr>
-            <w:r>
-              <w:rPr>
-                <w:rFonts w:ascii="Helvetica" w:hAnsi="Helvetica" w:cs="Helvetica"/>
-                <w:sz w:val="18"/>
-                <w:szCs w:val="18"/>
-              </w:rPr>
-              <w:t xml:space="preserve">0</w:t>
+              <w:t xml:space="preserve">45.938</w:t>
+            </w:r>
+          </w:p>
+        </w:tc>
+        <w:tc>
+          <w:tcPr>
+            <w:tcW w:w="3220" w:type="dxa"/>
+          </w:tcPr>
+          <w:p>
+            <w:pPr>
+              <w:spacing w:after="0"/>
+            </w:pPr>
+            <w:r>
+              <w:rPr>
+                <w:rFonts w:ascii="Helvetica" w:hAnsi="Helvetica" w:cs="Helvetica"/>
+                <w:sz w:val="18"/>
+                <w:szCs w:val="18"/>
+              </w:rPr>
+              <w:t xml:space="preserve">147.041.312.700</w:t>
             </w:r>
           </w:p>
         </w:tc>
@@ -3022,25 +3806,25 @@
                 <w:sz w:val="18"/>
                 <w:szCs w:val="18"/>
               </w:rPr>
-              <w:t xml:space="preserve">19.399</w:t>
-            </w:r>
-          </w:p>
-        </w:tc>
-        <w:tc>
-          <w:tcPr>
-            <w:tcW w:w="3220" w:type="dxa"/>
-          </w:tcPr>
-          <w:p>
-            <w:pPr>
-              <w:spacing w:after="0"/>
-            </w:pPr>
-            <w:r>
-              <w:rPr>
-                <w:rFonts w:ascii="Helvetica" w:hAnsi="Helvetica" w:cs="Helvetica"/>
-                <w:sz w:val="18"/>
-                <w:szCs w:val="18"/>
-              </w:rPr>
-              <w:t xml:space="preserve">0</w:t>
+              <w:t xml:space="preserve">32.969</w:t>
+            </w:r>
+          </w:p>
+        </w:tc>
+        <w:tc>
+          <w:tcPr>
+            <w:tcW w:w="3220" w:type="dxa"/>
+          </w:tcPr>
+          <w:p>
+            <w:pPr>
+              <w:spacing w:after="0"/>
+            </w:pPr>
+            <w:r>
+              <w:rPr>
+                <w:rFonts w:ascii="Helvetica" w:hAnsi="Helvetica" w:cs="Helvetica"/>
+                <w:sz w:val="18"/>
+                <w:szCs w:val="18"/>
+              </w:rPr>
+              <w:t xml:space="preserve">90.775.113.350</w:t>
             </w:r>
           </w:p>
         </w:tc>
@@ -3078,25 +3862,25 @@
                 <w:sz w:val="18"/>
                 <w:szCs w:val="18"/>
               </w:rPr>
-              <w:t xml:space="preserve">15.423</w:t>
-            </w:r>
-          </w:p>
-        </w:tc>
-        <w:tc>
-          <w:tcPr>
-            <w:tcW w:w="3220" w:type="dxa"/>
-          </w:tcPr>
-          <w:p>
-            <w:pPr>
-              <w:spacing w:after="0"/>
-            </w:pPr>
-            <w:r>
-              <w:rPr>
-                <w:rFonts w:ascii="Helvetica" w:hAnsi="Helvetica" w:cs="Helvetica"/>
-                <w:sz w:val="18"/>
-                <w:szCs w:val="18"/>
-              </w:rPr>
-              <w:t xml:space="preserve">0</w:t>
+              <w:t xml:space="preserve">31.588</w:t>
+            </w:r>
+          </w:p>
+        </w:tc>
+        <w:tc>
+          <w:tcPr>
+            <w:tcW w:w="3220" w:type="dxa"/>
+          </w:tcPr>
+          <w:p>
+            <w:pPr>
+              <w:spacing w:after="0"/>
+            </w:pPr>
+            <w:r>
+              <w:rPr>
+                <w:rFonts w:ascii="Helvetica" w:hAnsi="Helvetica" w:cs="Helvetica"/>
+                <w:sz w:val="18"/>
+                <w:szCs w:val="18"/>
+              </w:rPr>
+              <w:t xml:space="preserve">63.271.818.100</w:t>
             </w:r>
           </w:p>
         </w:tc>
@@ -3134,25 +3918,25 @@
                 <w:sz w:val="18"/>
                 <w:szCs w:val="18"/>
               </w:rPr>
-              <w:t xml:space="preserve">7.681</w:t>
-            </w:r>
-          </w:p>
-        </w:tc>
-        <w:tc>
-          <w:tcPr>
-            <w:tcW w:w="3220" w:type="dxa"/>
-          </w:tcPr>
-          <w:p>
-            <w:pPr>
-              <w:spacing w:after="0"/>
-            </w:pPr>
-            <w:r>
-              <w:rPr>
-                <w:rFonts w:ascii="Helvetica" w:hAnsi="Helvetica" w:cs="Helvetica"/>
-                <w:sz w:val="18"/>
-                <w:szCs w:val="18"/>
-              </w:rPr>
-              <w:t xml:space="preserve">0</w:t>
+              <w:t xml:space="preserve">17.608</w:t>
+            </w:r>
+          </w:p>
+        </w:tc>
+        <w:tc>
+          <w:tcPr>
+            <w:tcW w:w="3220" w:type="dxa"/>
+          </w:tcPr>
+          <w:p>
+            <w:pPr>
+              <w:spacing w:after="0"/>
+            </w:pPr>
+            <w:r>
+              <w:rPr>
+                <w:rFonts w:ascii="Helvetica" w:hAnsi="Helvetica" w:cs="Helvetica"/>
+                <w:sz w:val="18"/>
+                <w:szCs w:val="18"/>
+              </w:rPr>
+              <w:t xml:space="preserve">82.716.500.000</w:t>
             </w:r>
           </w:p>
         </w:tc>

</xml_diff>